<commit_message>
Added AWS certification, improved details
</commit_message>
<xml_diff>
--- a/Mohamad_Mostafa_CV.docx
+++ b/Mohamad_Mostafa_CV.docx
@@ -68,7 +68,13 @@
         <w:pStyle w:val="Normal"/>
         <w:spacing w:lineRule="auto" w:line="252" w:before="0" w:after="80"/>
         <w:jc w:val="center"/>
-        <w:rPr/>
+        <w:rPr>
+          <w:rStyle w:val="Hyperlink"/>
+          <w:rFonts w:ascii="C059" w:hAnsi="C059"/>
+          <w:sz w:val="18"/>
+          <w:szCs w:val="18"/>
+          <w:u w:val="none"/>
+        </w:rPr>
       </w:pPr>
       <w:r>
         <w:rPr>
@@ -134,28 +140,6 @@
     <w:p>
       <w:pPr>
         <w:pStyle w:val="Normal"/>
-        <w:spacing w:lineRule="auto" w:line="252" w:before="0" w:after="80"/>
-        <w:jc w:val="center"/>
-        <w:rPr>
-          <w:rStyle w:val="Hyperlink"/>
-          <w:rFonts w:ascii="C059" w:hAnsi="C059"/>
-          <w:sz w:val="18"/>
-          <w:szCs w:val="18"/>
-          <w:u w:val="none"/>
-        </w:rPr>
-      </w:pPr>
-      <w:r>
-        <w:rPr>
-          <w:rFonts w:ascii="C059" w:hAnsi="C059"/>
-          <w:sz w:val="18"/>
-          <w:szCs w:val="18"/>
-          <w:u w:val="none"/>
-        </w:rPr>
-      </w:r>
-    </w:p>
-    <w:p>
-      <w:pPr>
-        <w:pStyle w:val="Normal"/>
         <w:pBdr>
           <w:bottom w:val="single" w:sz="6" w:space="3" w:color="111111"/>
         </w:pBdr>
@@ -193,7 +177,39 @@
           <w:sz w:val="18"/>
           <w:szCs w:val="18"/>
         </w:rPr>
-        <w:t>Software Engineer with a B.Sc. in Computer Science and expertise in system design and full-stack development. Developed production-grade healthcare and media platforms, Built a bootable Linux kernel with custom drivers, and led technical operations for a NASA-affiliated event. Seeking Software Engineering roles in systems infrastructure, backend development, or full-stack engineering.</w:t>
+        <w:t xml:space="preserve">Software Engineer with a B.Sc. in Computer Science and expertise in system design and full-stack development. Developed production-grade healthcare and media platforms, Built a </w:t>
+      </w:r>
+      <w:r>
+        <w:rPr>
+          <w:rFonts w:ascii="C059" w:hAnsi="C059"/>
+          <w:sz w:val="18"/>
+          <w:szCs w:val="18"/>
+        </w:rPr>
+        <w:t>custom</w:t>
+      </w:r>
+      <w:r>
+        <w:rPr>
+          <w:rFonts w:ascii="C059" w:hAnsi="C059"/>
+          <w:sz w:val="18"/>
+          <w:szCs w:val="18"/>
+        </w:rPr>
+        <w:t xml:space="preserve"> Linux </w:t>
+      </w:r>
+      <w:r>
+        <w:rPr>
+          <w:rFonts w:ascii="C059" w:hAnsi="C059"/>
+          <w:sz w:val="18"/>
+          <w:szCs w:val="18"/>
+        </w:rPr>
+        <w:t>OS</w:t>
+      </w:r>
+      <w:r>
+        <w:rPr>
+          <w:rFonts w:ascii="C059" w:hAnsi="C059"/>
+          <w:sz w:val="18"/>
+          <w:szCs w:val="18"/>
+        </w:rPr>
+        <w:t>, and led technical operations for a NASA-affiliated event. Seeking Software Engineering roles in systems infrastructure or full-stack engineering.</w:t>
       </w:r>
     </w:p>
     <w:p>
@@ -243,7 +259,23 @@
           <w:sz w:val="18"/>
           <w:szCs w:val="18"/>
         </w:rPr>
-        <w:t>C, Java, Python, C#, C++, x86-64 Assembly, Shell Scripting, Prolog</w:t>
+        <w:t xml:space="preserve">C, Java, Python, C#, C++, </w:t>
+      </w:r>
+      <w:r>
+        <w:rPr>
+          <w:rFonts w:ascii="C059" w:hAnsi="C059"/>
+          <w:sz w:val="18"/>
+          <w:szCs w:val="18"/>
+        </w:rPr>
+        <w:t xml:space="preserve">JavaScript, </w:t>
+      </w:r>
+      <w:r>
+        <w:rPr>
+          <w:rFonts w:ascii="C059" w:hAnsi="C059"/>
+          <w:sz w:val="18"/>
+          <w:szCs w:val="18"/>
+        </w:rPr>
+        <w:t>x86-64 Assembly, Shell Scripting, Prolog</w:t>
       </w:r>
     </w:p>
     <w:p>
@@ -272,7 +304,63 @@
           <w:sz w:val="18"/>
           <w:szCs w:val="18"/>
         </w:rPr>
-        <w:t>: PHP, .NET Framework, Python (Flask, Django), HTML, CSS, JavaScript, SQL, R-Databases</w:t>
+        <w:t xml:space="preserve">: PHP, .NET Framework, HTML, CSS, </w:t>
+      </w:r>
+      <w:r>
+        <w:rPr>
+          <w:rFonts w:ascii="C059" w:hAnsi="C059"/>
+          <w:sz w:val="18"/>
+          <w:szCs w:val="18"/>
+        </w:rPr>
+        <w:t>React, NodeJS</w:t>
+      </w:r>
+      <w:r>
+        <w:rPr>
+          <w:rFonts w:ascii="C059" w:hAnsi="C059"/>
+          <w:sz w:val="18"/>
+          <w:szCs w:val="18"/>
+        </w:rPr>
+        <w:t xml:space="preserve">, </w:t>
+      </w:r>
+      <w:r>
+        <w:rPr>
+          <w:rFonts w:ascii="C059" w:hAnsi="C059"/>
+          <w:sz w:val="18"/>
+          <w:szCs w:val="18"/>
+        </w:rPr>
+        <w:t>MERN,</w:t>
+      </w:r>
+      <w:r>
+        <w:rPr>
+          <w:rFonts w:ascii="C059" w:hAnsi="C059"/>
+          <w:sz w:val="18"/>
+          <w:szCs w:val="18"/>
+        </w:rPr>
+        <w:t xml:space="preserve"> Python (Flask),</w:t>
+      </w:r>
+      <w:r>
+        <w:rPr>
+          <w:rFonts w:ascii="C059" w:hAnsi="C059"/>
+          <w:sz w:val="18"/>
+          <w:szCs w:val="18"/>
+        </w:rPr>
+        <w:t xml:space="preserve"> </w:t>
+      </w:r>
+      <w:r>
+        <w:rPr>
+          <w:rFonts w:ascii="C059" w:hAnsi="C059"/>
+          <w:sz w:val="18"/>
+          <w:szCs w:val="18"/>
+        </w:rPr>
+        <w:t xml:space="preserve">SQL, </w:t>
+      </w:r>
+      <w:r>
+        <w:rPr>
+          <w:rFonts w:ascii="C059" w:hAnsi="C059"/>
+          <w:sz w:val="18"/>
+          <w:szCs w:val="18"/>
+        </w:rPr>
+        <w:t>NoSQL</w:t>
       </w:r>
     </w:p>
     <w:p>
@@ -340,6 +428,37 @@
     <w:p>
       <w:pPr>
         <w:pStyle w:val="Normal"/>
+        <w:numPr>
+          <w:ilvl w:val="0"/>
+          <w:numId w:val="9"/>
+        </w:numPr>
+        <w:spacing w:lineRule="auto" w:line="252" w:before="0" w:after="60"/>
+        <w:rPr>
+          <w:rFonts w:ascii="C059" w:hAnsi="C059"/>
+        </w:rPr>
+      </w:pPr>
+      <w:r>
+        <w:rPr>
+          <w:rFonts w:ascii="C059" w:hAnsi="C059"/>
+          <w:b/>
+          <w:bCs/>
+          <w:sz w:val="18"/>
+          <w:szCs w:val="18"/>
+        </w:rPr>
+        <w:t>Side Interests</w:t>
+      </w:r>
+      <w:r>
+        <w:rPr>
+          <w:rFonts w:ascii="C059" w:hAnsi="C059"/>
+          <w:sz w:val="18"/>
+          <w:szCs w:val="18"/>
+        </w:rPr>
+        <w:t>: Experimental Art, Visual Art, Film History, Geography, Psychology, Snooker</w:t>
+      </w:r>
+    </w:p>
+    <w:p>
+      <w:pPr>
+        <w:pStyle w:val="Normal"/>
         <w:pBdr>
           <w:bottom w:val="single" w:sz="6" w:space="3" w:color="111111"/>
         </w:pBdr>
@@ -390,13 +509,24 @@
           <w:rFonts w:ascii="C059" w:hAnsi="C059"/>
           <w:b w:val="false"/>
           <w:bCs w:val="false"/>
+          <w:sz w:val="18"/>
+          <w:szCs w:val="18"/>
+          <w:u w:val="none"/>
+        </w:rPr>
+        <w:t>Technical Operations</w:t>
+      </w:r>
+      <w:r>
+        <w:rPr>
+          <w:rFonts w:ascii="C059" w:hAnsi="C059"/>
+          <w:b w:val="false"/>
+          <w:bCs w:val="false"/>
           <w:i w:val="false"/>
           <w:iCs w:val="false"/>
           <w:sz w:val="18"/>
           <w:szCs w:val="18"/>
           <w:u w:val="none"/>
         </w:rPr>
-        <w:t xml:space="preserve">Web Developmnet </w:t>
+        <w:t xml:space="preserve"> </w:t>
       </w:r>
       <w:r>
         <w:rPr>
@@ -587,7 +717,7 @@
           <w:szCs w:val="18"/>
         </w:rPr>
         <w:tab/>
-        <w:t xml:space="preserve">Full-Stack Web Development, GUI Development, Software Engineering, Data Structures &amp; Algorithms, </w:t>
+        <w:t>Full-Stack Web Development, GUI Development, Data Structures &amp; Algorithms, Databases,</w:t>
       </w:r>
     </w:p>
     <w:p>
@@ -836,6 +966,77 @@
           <w:szCs w:val="18"/>
           <w:vertAlign w:val="baseline"/>
         </w:rPr>
+        <w:t>AWS Certified AI Practitioner</w:t>
+      </w:r>
+      <w:r>
+        <w:rPr>
+          <w:rFonts w:ascii="C059" w:hAnsi="C059"/>
+          <w:b/>
+          <w:bCs/>
+          <w:strike w:val="false"/>
+          <w:dstrike w:val="false"/>
+          <w:position w:val="0"/>
+          <w:sz w:val="18"/>
+          <w:sz w:val="18"/>
+          <w:szCs w:val="18"/>
+          <w:vertAlign w:val="baseline"/>
+        </w:rPr>
+        <w:t xml:space="preserve"> </w:t>
+      </w:r>
+      <w:r>
+        <w:rPr>
+          <w:rFonts w:ascii="C059" w:hAnsi="C059"/>
+          <w:b w:val="false"/>
+          <w:bCs w:val="false"/>
+          <w:strike w:val="false"/>
+          <w:dstrike w:val="false"/>
+          <w:position w:val="0"/>
+          <w:sz w:val="18"/>
+          <w:sz w:val="18"/>
+          <w:szCs w:val="18"/>
+          <w:vertAlign w:val="baseline"/>
+        </w:rPr>
+        <w:t xml:space="preserve">— </w:t>
+      </w:r>
+      <w:r>
+        <w:rPr>
+          <w:rFonts w:ascii="C059" w:hAnsi="C059"/>
+          <w:b/>
+          <w:bCs/>
+          <w:strike w:val="false"/>
+          <w:dstrike w:val="false"/>
+          <w:position w:val="0"/>
+          <w:sz w:val="18"/>
+          <w:sz w:val="18"/>
+          <w:szCs w:val="18"/>
+          <w:vertAlign w:val="baseline"/>
+        </w:rPr>
+        <w:t>Amazon Web Services (AWS)</w:t>
+      </w:r>
+    </w:p>
+    <w:p>
+      <w:pPr>
+        <w:pStyle w:val="Normal"/>
+        <w:numPr>
+          <w:ilvl w:val="0"/>
+          <w:numId w:val="7"/>
+        </w:numPr>
+        <w:spacing w:lineRule="auto" w:line="252" w:before="0" w:after="60"/>
+        <w:rPr/>
+      </w:pPr>
+      <w:r>
+        <w:rPr>
+          <w:rFonts w:ascii="C059" w:hAnsi="C059"/>
+          <w:b w:val="false"/>
+          <w:bCs w:val="false"/>
+          <w:strike w:val="false"/>
+          <w:dstrike w:val="false"/>
+          <w:position w:val="0"/>
+          <w:sz w:val="18"/>
+          <w:sz w:val="18"/>
+          <w:szCs w:val="18"/>
+          <w:vertAlign w:val="baseline"/>
+        </w:rPr>
         <w:t>Data Science and Analytics &amp; Agile Project Management  —</w:t>
       </w:r>
       <w:r>
@@ -1242,27 +1443,7 @@
           <w:szCs w:val="18"/>
           <w:u w:val="none"/>
         </w:rPr>
-        <w:t>RegexBuilder</w:t>
-      </w:r>
-      <w:r>
-        <w:rPr>
-          <w:rFonts w:ascii="C059" w:hAnsi="C059"/>
-          <w:b/>
-          <w:sz w:val="18"/>
-          <w:szCs w:val="18"/>
-          <w:u w:val="none"/>
-        </w:rPr>
-        <w:t xml:space="preserve"> [Java</w:t>
-      </w:r>
-      <w:r>
-        <w:rPr>
-          <w:rFonts w:ascii="C059" w:hAnsi="C059"/>
-          <w:b/>
-          <w:sz w:val="18"/>
-          <w:szCs w:val="18"/>
-          <w:u w:val="none"/>
-        </w:rPr>
-        <w:t>]</w:t>
+        <w:t>RegexBuilder [Java]</w:t>
       </w:r>
     </w:p>
     <w:p>
@@ -1285,29 +1466,7 @@
           <w:szCs w:val="18"/>
           <w:u w:val="none"/>
         </w:rPr>
-        <w:t xml:space="preserve">A chainable </w:t>
-      </w:r>
-      <w:r>
-        <w:rPr>
-          <w:rStyle w:val="Hyperlink"/>
-          <w:rFonts w:ascii="C059" w:hAnsi="C059"/>
-          <w:color w:val="000000"/>
-          <w:sz w:val="18"/>
-          <w:szCs w:val="18"/>
-          <w:u w:val="none"/>
-        </w:rPr>
-        <w:t>Java library for building regular expression</w:t>
-      </w:r>
-      <w:r>
-        <w:rPr>
-          <w:rStyle w:val="Hyperlink"/>
-          <w:rFonts w:ascii="C059" w:hAnsi="C059"/>
-          <w:color w:val="000000"/>
-          <w:sz w:val="18"/>
-          <w:szCs w:val="18"/>
-          <w:u w:val="none"/>
-        </w:rPr>
-        <w:t>s</w:t>
+        <w:t>A chainable Java library for building regular expressions</w:t>
       </w:r>
       <w:r>
         <w:rPr>

</xml_diff>